<commit_message>
ajuste: corrigir envio multipart parse-docs
</commit_message>
<xml_diff>
--- a/src/templates/folha_rosto/custos_incorridos_edge.docx
+++ b/src/templates/folha_rosto/custos_incorridos_edge.docx
@@ -78,27 +78,43 @@
                 <w:sz w:val="24"/>
                 <w:szCs w:val="24"/>
               </w:rPr>
-              <w:t>{{</w:t>
-            </w:r>
-            <w:proofErr w:type="spellStart"/>
-            <w:r>
-              <w:rPr>
-                <w:rFonts w:ascii="Arial" w:eastAsia="Arial" w:hAnsi="Arial" w:cs="Arial"/>
-                <w:color w:val="000000"/>
-                <w:sz w:val="24"/>
-                <w:szCs w:val="24"/>
-              </w:rPr>
-              <w:t>instituicao</w:t>
-            </w:r>
-            <w:proofErr w:type="spellEnd"/>
-            <w:r>
-              <w:rPr>
-                <w:rFonts w:ascii="Arial" w:eastAsia="Arial" w:hAnsi="Arial" w:cs="Arial"/>
-                <w:color w:val="000000"/>
-                <w:sz w:val="24"/>
-                <w:szCs w:val="24"/>
-              </w:rPr>
-              <w:t>}}</w:t>
+              <w:t>{</w:t>
+            </w:r>
+            <w:r>
+              <w:rPr>
+                <w:rFonts w:ascii="Arial" w:eastAsia="Arial" w:hAnsi="Arial" w:cs="Arial"/>
+                <w:color w:val="000000"/>
+                <w:sz w:val="24"/>
+                <w:szCs w:val="24"/>
+              </w:rPr>
+              <w:t>{</w:t>
+            </w:r>
+            <w:r>
+              <w:rPr>
+                <w:rFonts w:ascii="Arial" w:eastAsia="Arial" w:hAnsi="Arial" w:cs="Arial"/>
+                <w:color w:val="000000"/>
+                <w:sz w:val="24"/>
+                <w:szCs w:val="24"/>
+              </w:rPr>
+              <w:t>i</w:t>
+            </w:r>
+            <w:r>
+              <w:rPr>
+                <w:rFonts w:ascii="Arial" w:eastAsia="Arial" w:hAnsi="Arial" w:cs="Arial"/>
+                <w:color w:val="000000"/>
+                <w:sz w:val="24"/>
+                <w:szCs w:val="24"/>
+              </w:rPr>
+              <w:t>nstituicao}</w:t>
+            </w:r>
+            <w:r>
+              <w:rPr>
+                <w:rFonts w:ascii="Arial" w:eastAsia="Arial" w:hAnsi="Arial" w:cs="Arial"/>
+                <w:color w:val="000000"/>
+                <w:sz w:val="24"/>
+                <w:szCs w:val="24"/>
+              </w:rPr>
+              <w:t>}</w:t>
             </w:r>
           </w:p>
         </w:tc>
@@ -229,27 +245,25 @@
                 <w:sz w:val="24"/>
                 <w:szCs w:val="24"/>
               </w:rPr>
-              <w:t>{{</w:t>
-            </w:r>
-            <w:proofErr w:type="spellStart"/>
-            <w:r>
-              <w:rPr>
-                <w:rFonts w:ascii="Arial" w:eastAsia="Arial" w:hAnsi="Arial" w:cs="Arial"/>
-                <w:color w:val="000000"/>
-                <w:sz w:val="24"/>
-                <w:szCs w:val="24"/>
-              </w:rPr>
-              <w:t>projeto_codigo</w:t>
-            </w:r>
-            <w:proofErr w:type="spellEnd"/>
-            <w:r>
-              <w:rPr>
-                <w:rFonts w:ascii="Arial" w:eastAsia="Arial" w:hAnsi="Arial" w:cs="Arial"/>
-                <w:color w:val="000000"/>
-                <w:sz w:val="24"/>
-                <w:szCs w:val="24"/>
-              </w:rPr>
-              <w:t>}}</w:t>
+              <w:t>{</w:t>
+            </w:r>
+            <w:r>
+              <w:rPr>
+                <w:rFonts w:ascii="Arial" w:eastAsia="Arial" w:hAnsi="Arial" w:cs="Arial"/>
+                <w:color w:val="000000"/>
+                <w:sz w:val="24"/>
+                <w:szCs w:val="24"/>
+              </w:rPr>
+              <w:t>{projeto_codigo}</w:t>
+            </w:r>
+            <w:r>
+              <w:rPr>
+                <w:rFonts w:ascii="Arial" w:eastAsia="Arial" w:hAnsi="Arial" w:cs="Arial"/>
+                <w:color w:val="000000"/>
+                <w:sz w:val="24"/>
+                <w:szCs w:val="24"/>
+              </w:rPr>
+              <w:t>}</w:t>
             </w:r>
           </w:p>
         </w:tc>
@@ -308,9 +322,17 @@
                 <w:sz w:val="24"/>
                 <w:szCs w:val="24"/>
               </w:rPr>
-              <w:t>{{</w:t>
-            </w:r>
-            <w:proofErr w:type="spellStart"/>
+              <w:t>{</w:t>
+            </w:r>
+            <w:r>
+              <w:rPr>
+                <w:rFonts w:ascii="Arial" w:eastAsia="Arial" w:hAnsi="Arial" w:cs="Arial"/>
+                <w:color w:val="000000"/>
+                <w:sz w:val="24"/>
+                <w:szCs w:val="24"/>
+              </w:rPr>
+              <w:t>{</w:t>
+            </w:r>
             <w:r>
               <w:rPr>
                 <w:rFonts w:ascii="Arial" w:eastAsia="Arial" w:hAnsi="Arial" w:cs="Arial"/>
@@ -320,15 +342,23 @@
               </w:rPr>
               <w:t>projeto_nome</w:t>
             </w:r>
-            <w:proofErr w:type="spellEnd"/>
-            <w:r>
-              <w:rPr>
-                <w:rFonts w:ascii="Arial" w:eastAsia="Arial" w:hAnsi="Arial" w:cs="Arial"/>
-                <w:color w:val="000000"/>
-                <w:sz w:val="24"/>
-                <w:szCs w:val="24"/>
-              </w:rPr>
-              <w:t>}}</w:t>
+            <w:r>
+              <w:rPr>
+                <w:rFonts w:ascii="Arial" w:eastAsia="Arial" w:hAnsi="Arial" w:cs="Arial"/>
+                <w:color w:val="000000"/>
+                <w:sz w:val="24"/>
+                <w:szCs w:val="24"/>
+              </w:rPr>
+              <w:t>}</w:t>
+            </w:r>
+            <w:r>
+              <w:rPr>
+                <w:rFonts w:ascii="Arial" w:eastAsia="Arial" w:hAnsi="Arial" w:cs="Arial"/>
+                <w:color w:val="000000"/>
+                <w:sz w:val="24"/>
+                <w:szCs w:val="24"/>
+              </w:rPr>
+              <w:t>}</w:t>
             </w:r>
           </w:p>
         </w:tc>
@@ -430,38 +460,43 @@
                 <w:sz w:val="24"/>
                 <w:szCs w:val="24"/>
               </w:rPr>
-              <w:t>{{</w:t>
-            </w:r>
-            <w:proofErr w:type="spellStart"/>
-            <w:r>
-              <w:rPr>
-                <w:rFonts w:ascii="Arial" w:eastAsia="Arial" w:hAnsi="Arial" w:cs="Arial"/>
-                <w:color w:val="000000"/>
-                <w:sz w:val="24"/>
-                <w:szCs w:val="24"/>
-              </w:rPr>
-              <w:t>pc_</w:t>
-            </w:r>
-            <w:proofErr w:type="gramStart"/>
-            <w:r>
-              <w:rPr>
-                <w:rFonts w:ascii="Arial" w:eastAsia="Arial" w:hAnsi="Arial" w:cs="Arial"/>
-                <w:color w:val="000000"/>
-                <w:sz w:val="24"/>
-                <w:szCs w:val="24"/>
-              </w:rPr>
-              <w:t>numero</w:t>
-            </w:r>
-            <w:proofErr w:type="spellEnd"/>
-            <w:proofErr w:type="gramEnd"/>
-            <w:r>
-              <w:rPr>
-                <w:rFonts w:ascii="Arial" w:eastAsia="Arial" w:hAnsi="Arial" w:cs="Arial"/>
-                <w:color w:val="000000"/>
-                <w:sz w:val="24"/>
-                <w:szCs w:val="24"/>
-              </w:rPr>
-              <w:t>}}</w:t>
+              <w:t>{</w:t>
+            </w:r>
+            <w:r>
+              <w:rPr>
+                <w:rFonts w:ascii="Arial" w:eastAsia="Arial" w:hAnsi="Arial" w:cs="Arial"/>
+                <w:color w:val="000000"/>
+                <w:sz w:val="24"/>
+                <w:szCs w:val="24"/>
+              </w:rPr>
+              <w:t>{</w:t>
+            </w:r>
+            <w:r>
+              <w:rPr>
+                <w:rFonts w:ascii="Arial" w:eastAsia="Arial" w:hAnsi="Arial" w:cs="Arial"/>
+                <w:color w:val="000000"/>
+                <w:sz w:val="24"/>
+                <w:szCs w:val="24"/>
+              </w:rPr>
+              <w:t>pc_numero</w:t>
+            </w:r>
+            <w:r>
+              <w:rPr>
+                <w:rFonts w:ascii="Arial" w:eastAsia="Arial" w:hAnsi="Arial" w:cs="Arial"/>
+                <w:color w:val="000000"/>
+                <w:sz w:val="24"/>
+                <w:szCs w:val="24"/>
+              </w:rPr>
+              <w:t>}</w:t>
+            </w:r>
+            <w:r>
+              <w:rPr>
+                <w:rFonts w:ascii="Arial" w:eastAsia="Arial" w:hAnsi="Arial" w:cs="Arial"/>
+                <w:color w:val="000000"/>
+                <w:sz w:val="24"/>
+                <w:szCs w:val="24"/>
+              </w:rPr>
+              <w:t>}</w:t>
             </w:r>
           </w:p>
         </w:tc>
@@ -470,14 +505,12 @@
     <w:p/>
     <w:tbl>
       <w:tblPr>
-        <w:tblStyle w:val="a2"/>
-        <w:tblW w:w="9781" w:type="dxa"/>
-        <w:tblInd w:w="0" w:type="dxa"/>
+        <w:tblW w:w="9780" w:type="dxa"/>
         <w:tblLayout w:type="fixed"/>
         <w:tblLook w:val="0400" w:firstRow="0" w:lastRow="0" w:firstColumn="0" w:lastColumn="0" w:noHBand="0" w:noVBand="1"/>
       </w:tblPr>
       <w:tblGrid>
-        <w:gridCol w:w="2268"/>
+        <w:gridCol w:w="2267"/>
         <w:gridCol w:w="993"/>
         <w:gridCol w:w="1417"/>
         <w:gridCol w:w="425"/>
@@ -491,7 +524,7 @@
         </w:trPr>
         <w:tc>
           <w:tcPr>
-            <w:tcW w:w="2268" w:type="dxa"/>
+            <w:tcW w:w="2267" w:type="dxa"/>
             <w:tcBorders>
               <w:top w:val="single" w:sz="4" w:space="0" w:color="000000"/>
               <w:left w:val="single" w:sz="4" w:space="0" w:color="000000"/>
@@ -506,19 +539,27 @@
               <w:right w:w="45" w:type="dxa"/>
             </w:tcMar>
             <w:vAlign w:val="center"/>
+            <w:hideMark/>
           </w:tcPr>
           <w:p>
             <w:pPr>
+              <w:spacing w:after="0" w:line="240" w:lineRule="auto"/>
               <w:jc w:val="center"/>
               <w:rPr>
                 <w:rFonts w:ascii="Arial" w:eastAsia="Arial" w:hAnsi="Arial" w:cs="Arial"/>
                 <w:b/>
+                <w:color w:val="404040"/>
+                <w:sz w:val="16"/>
+                <w:szCs w:val="16"/>
               </w:rPr>
             </w:pPr>
             <w:r>
               <w:rPr>
                 <w:rFonts w:ascii="Arial" w:eastAsia="Arial" w:hAnsi="Arial" w:cs="Arial"/>
                 <w:b/>
+                <w:color w:val="404040"/>
+                <w:sz w:val="16"/>
+                <w:szCs w:val="16"/>
               </w:rPr>
               <w:t>Natureza de Dispêndio</w:t>
             </w:r>
@@ -534,19 +575,25 @@
               <w:bottom w:val="single" w:sz="4" w:space="0" w:color="000000"/>
               <w:right w:val="single" w:sz="4" w:space="0" w:color="000000"/>
             </w:tcBorders>
+            <w:hideMark/>
           </w:tcPr>
           <w:p>
             <w:pPr>
+              <w:spacing w:after="0" w:line="240" w:lineRule="auto"/>
               <w:jc w:val="center"/>
               <w:rPr>
                 <w:rFonts w:ascii="Arial" w:eastAsia="Arial" w:hAnsi="Arial" w:cs="Arial"/>
-                <w:bCs/>
+                <w:color w:val="404040"/>
+                <w:sz w:val="16"/>
+                <w:szCs w:val="16"/>
               </w:rPr>
             </w:pPr>
             <w:r>
               <w:rPr>
                 <w:rFonts w:ascii="Arial" w:eastAsia="Arial" w:hAnsi="Arial" w:cs="Arial"/>
-                <w:bCs/>
+                <w:color w:val="404040"/>
+                <w:sz w:val="16"/>
+                <w:szCs w:val="16"/>
               </w:rPr>
               <w:t>{{rubrica}}</w:t>
             </w:r>
@@ -559,7 +606,7 @@
         </w:trPr>
         <w:tc>
           <w:tcPr>
-            <w:tcW w:w="4678" w:type="dxa"/>
+            <w:tcW w:w="4677" w:type="dxa"/>
             <w:gridSpan w:val="3"/>
             <w:tcBorders>
               <w:top w:val="single" w:sz="4" w:space="0" w:color="000000"/>
@@ -575,19 +622,27 @@
               <w:right w:w="45" w:type="dxa"/>
             </w:tcMar>
             <w:vAlign w:val="center"/>
+            <w:hideMark/>
           </w:tcPr>
           <w:p>
             <w:pPr>
+              <w:spacing w:after="0" w:line="240" w:lineRule="auto"/>
               <w:jc w:val="center"/>
               <w:rPr>
                 <w:rFonts w:ascii="Arial" w:eastAsia="Arial" w:hAnsi="Arial" w:cs="Arial"/>
                 <w:b/>
+                <w:color w:val="404040"/>
+                <w:sz w:val="16"/>
+                <w:szCs w:val="16"/>
               </w:rPr>
             </w:pPr>
             <w:r>
               <w:rPr>
                 <w:rFonts w:ascii="Arial" w:eastAsia="Arial" w:hAnsi="Arial" w:cs="Arial"/>
                 <w:b/>
+                <w:color w:val="404040"/>
+                <w:sz w:val="16"/>
+                <w:szCs w:val="16"/>
               </w:rPr>
               <w:t>Favorecido</w:t>
             </w:r>
@@ -611,19 +666,27 @@
               <w:right w:w="45" w:type="dxa"/>
             </w:tcMar>
             <w:vAlign w:val="center"/>
+            <w:hideMark/>
           </w:tcPr>
           <w:p>
             <w:pPr>
+              <w:spacing w:after="0" w:line="240" w:lineRule="auto"/>
               <w:jc w:val="center"/>
               <w:rPr>
                 <w:rFonts w:ascii="Arial" w:eastAsia="Arial" w:hAnsi="Arial" w:cs="Arial"/>
                 <w:b/>
+                <w:color w:val="404040"/>
+                <w:sz w:val="16"/>
+                <w:szCs w:val="16"/>
               </w:rPr>
             </w:pPr>
             <w:r>
               <w:rPr>
                 <w:rFonts w:ascii="Arial" w:eastAsia="Arial" w:hAnsi="Arial" w:cs="Arial"/>
                 <w:b/>
+                <w:color w:val="404040"/>
+                <w:sz w:val="16"/>
+                <w:szCs w:val="16"/>
               </w:rPr>
               <w:t>CNPJ OU CPF</w:t>
             </w:r>
@@ -646,19 +709,27 @@
               <w:right w:w="45" w:type="dxa"/>
             </w:tcMar>
             <w:vAlign w:val="center"/>
+            <w:hideMark/>
           </w:tcPr>
           <w:p>
             <w:pPr>
+              <w:spacing w:after="0" w:line="240" w:lineRule="auto"/>
               <w:jc w:val="center"/>
               <w:rPr>
                 <w:rFonts w:ascii="Arial" w:eastAsia="Arial" w:hAnsi="Arial" w:cs="Arial"/>
                 <w:b/>
+                <w:color w:val="404040"/>
+                <w:sz w:val="16"/>
+                <w:szCs w:val="16"/>
               </w:rPr>
             </w:pPr>
             <w:r>
               <w:rPr>
                 <w:rFonts w:ascii="Arial" w:eastAsia="Arial" w:hAnsi="Arial" w:cs="Arial"/>
                 <w:b/>
+                <w:color w:val="404040"/>
+                <w:sz w:val="16"/>
+                <w:szCs w:val="16"/>
               </w:rPr>
               <w:t>Nº Extrato</w:t>
             </w:r>
@@ -671,7 +742,7 @@
         </w:trPr>
         <w:tc>
           <w:tcPr>
-            <w:tcW w:w="4678" w:type="dxa"/>
+            <w:tcW w:w="4677" w:type="dxa"/>
             <w:gridSpan w:val="3"/>
             <w:tcBorders>
               <w:top w:val="single" w:sz="4" w:space="0" w:color="000000"/>
@@ -686,19 +757,25 @@
               <w:right w:w="45" w:type="dxa"/>
             </w:tcMar>
             <w:vAlign w:val="center"/>
+            <w:hideMark/>
           </w:tcPr>
           <w:p>
             <w:pPr>
+              <w:spacing w:after="0" w:line="240" w:lineRule="auto"/>
               <w:jc w:val="center"/>
               <w:rPr>
                 <w:rFonts w:ascii="Arial" w:eastAsia="Arial" w:hAnsi="Arial" w:cs="Arial"/>
-                <w:bCs/>
+                <w:color w:val="404040"/>
+                <w:sz w:val="16"/>
+                <w:szCs w:val="16"/>
               </w:rPr>
             </w:pPr>
             <w:r>
               <w:rPr>
                 <w:rFonts w:ascii="Arial" w:eastAsia="Arial" w:hAnsi="Arial" w:cs="Arial"/>
-                <w:bCs/>
+                <w:color w:val="404040"/>
+                <w:sz w:val="16"/>
+                <w:szCs w:val="16"/>
               </w:rPr>
               <w:t>{{favorecido}}</w:t>
             </w:r>
@@ -721,37 +798,27 @@
               <w:right w:w="45" w:type="dxa"/>
             </w:tcMar>
             <w:vAlign w:val="center"/>
+            <w:hideMark/>
           </w:tcPr>
           <w:p>
             <w:pPr>
+              <w:spacing w:after="0" w:line="240" w:lineRule="auto"/>
               <w:jc w:val="center"/>
               <w:rPr>
                 <w:rFonts w:ascii="Arial" w:eastAsia="Arial" w:hAnsi="Arial" w:cs="Arial"/>
-                <w:bCs/>
+                <w:color w:val="404040"/>
+                <w:sz w:val="16"/>
+                <w:szCs w:val="16"/>
               </w:rPr>
             </w:pPr>
             <w:r>
               <w:rPr>
                 <w:rFonts w:ascii="Arial" w:eastAsia="Arial" w:hAnsi="Arial" w:cs="Arial"/>
-                <w:bCs/>
-              </w:rPr>
-              <w:t>{{</w:t>
-            </w:r>
-            <w:proofErr w:type="spellStart"/>
-            <w:r>
-              <w:rPr>
-                <w:rFonts w:ascii="Arial" w:eastAsia="Arial" w:hAnsi="Arial" w:cs="Arial"/>
-                <w:bCs/>
-              </w:rPr>
-              <w:t>cnpj</w:t>
-            </w:r>
-            <w:proofErr w:type="spellEnd"/>
-            <w:r>
-              <w:rPr>
-                <w:rFonts w:ascii="Arial" w:eastAsia="Arial" w:hAnsi="Arial" w:cs="Arial"/>
-                <w:bCs/>
-              </w:rPr>
-              <w:t>}}</w:t>
+                <w:color w:val="404040"/>
+                <w:sz w:val="16"/>
+                <w:szCs w:val="16"/>
+              </w:rPr>
+              <w:t>{{cnpj}}</w:t>
             </w:r>
           </w:p>
         </w:tc>
@@ -771,37 +838,27 @@
               <w:right w:w="45" w:type="dxa"/>
             </w:tcMar>
             <w:vAlign w:val="center"/>
+            <w:hideMark/>
           </w:tcPr>
           <w:p>
             <w:pPr>
+              <w:spacing w:after="0" w:line="240" w:lineRule="auto"/>
               <w:jc w:val="center"/>
               <w:rPr>
                 <w:rFonts w:ascii="Arial" w:eastAsia="Arial" w:hAnsi="Arial" w:cs="Arial"/>
-                <w:bCs/>
+                <w:color w:val="404040"/>
+                <w:sz w:val="16"/>
+                <w:szCs w:val="16"/>
               </w:rPr>
             </w:pPr>
             <w:r>
               <w:rPr>
                 <w:rFonts w:ascii="Arial" w:eastAsia="Arial" w:hAnsi="Arial" w:cs="Arial"/>
-                <w:bCs/>
-              </w:rPr>
-              <w:t>{{</w:t>
-            </w:r>
-            <w:proofErr w:type="spellStart"/>
-            <w:r>
-              <w:rPr>
-                <w:rFonts w:ascii="Arial" w:eastAsia="Arial" w:hAnsi="Arial" w:cs="Arial"/>
-                <w:bCs/>
-              </w:rPr>
-              <w:t>n_extrato</w:t>
-            </w:r>
-            <w:proofErr w:type="spellEnd"/>
-            <w:r>
-              <w:rPr>
-                <w:rFonts w:ascii="Arial" w:eastAsia="Arial" w:hAnsi="Arial" w:cs="Arial"/>
-                <w:bCs/>
-              </w:rPr>
-              <w:t>}}</w:t>
+                <w:color w:val="404040"/>
+                <w:sz w:val="16"/>
+                <w:szCs w:val="16"/>
+              </w:rPr>
+              <w:t>{{n_extrato}}</w:t>
             </w:r>
           </w:p>
         </w:tc>
@@ -812,7 +869,7 @@
         </w:trPr>
         <w:tc>
           <w:tcPr>
-            <w:tcW w:w="3261" w:type="dxa"/>
+            <w:tcW w:w="3260" w:type="dxa"/>
             <w:gridSpan w:val="2"/>
             <w:tcBorders>
               <w:top w:val="single" w:sz="4" w:space="0" w:color="000000"/>
@@ -828,19 +885,27 @@
               <w:right w:w="45" w:type="dxa"/>
             </w:tcMar>
             <w:vAlign w:val="center"/>
+            <w:hideMark/>
           </w:tcPr>
           <w:p>
             <w:pPr>
+              <w:spacing w:after="0" w:line="240" w:lineRule="auto"/>
               <w:jc w:val="center"/>
               <w:rPr>
                 <w:rFonts w:ascii="Arial" w:eastAsia="Arial" w:hAnsi="Arial" w:cs="Arial"/>
                 <w:b/>
+                <w:color w:val="404040"/>
+                <w:sz w:val="16"/>
+                <w:szCs w:val="16"/>
               </w:rPr>
             </w:pPr>
             <w:r>
               <w:rPr>
                 <w:rFonts w:ascii="Arial" w:eastAsia="Arial" w:hAnsi="Arial" w:cs="Arial"/>
                 <w:b/>
+                <w:color w:val="404040"/>
+                <w:sz w:val="16"/>
+                <w:szCs w:val="16"/>
               </w:rPr>
               <w:t>NF/ND</w:t>
             </w:r>
@@ -864,19 +929,27 @@
               <w:right w:w="45" w:type="dxa"/>
             </w:tcMar>
             <w:vAlign w:val="center"/>
+            <w:hideMark/>
           </w:tcPr>
           <w:p>
             <w:pPr>
+              <w:spacing w:after="0" w:line="240" w:lineRule="auto"/>
               <w:jc w:val="center"/>
               <w:rPr>
                 <w:rFonts w:ascii="Arial" w:eastAsia="Arial" w:hAnsi="Arial" w:cs="Arial"/>
                 <w:b/>
+                <w:color w:val="404040"/>
+                <w:sz w:val="16"/>
+                <w:szCs w:val="16"/>
               </w:rPr>
             </w:pPr>
             <w:r>
               <w:rPr>
                 <w:rFonts w:ascii="Arial" w:eastAsia="Arial" w:hAnsi="Arial" w:cs="Arial"/>
                 <w:b/>
+                <w:color w:val="404040"/>
+                <w:sz w:val="16"/>
+                <w:szCs w:val="16"/>
               </w:rPr>
               <w:t>Data de emissão da NF/ND</w:t>
             </w:r>
@@ -899,19 +972,27 @@
               <w:right w:w="45" w:type="dxa"/>
             </w:tcMar>
             <w:vAlign w:val="center"/>
+            <w:hideMark/>
           </w:tcPr>
           <w:p>
             <w:pPr>
+              <w:spacing w:after="0" w:line="240" w:lineRule="auto"/>
               <w:jc w:val="center"/>
               <w:rPr>
                 <w:rFonts w:ascii="Arial" w:eastAsia="Arial" w:hAnsi="Arial" w:cs="Arial"/>
                 <w:b/>
+                <w:color w:val="404040"/>
+                <w:sz w:val="16"/>
+                <w:szCs w:val="16"/>
               </w:rPr>
             </w:pPr>
             <w:r>
               <w:rPr>
                 <w:rFonts w:ascii="Arial" w:eastAsia="Arial" w:hAnsi="Arial" w:cs="Arial"/>
                 <w:b/>
+                <w:color w:val="404040"/>
+                <w:sz w:val="16"/>
+                <w:szCs w:val="16"/>
               </w:rPr>
               <w:t>Data do pagamento</w:t>
             </w:r>
@@ -935,19 +1016,27 @@
               <w:right w:w="45" w:type="dxa"/>
             </w:tcMar>
             <w:vAlign w:val="center"/>
+            <w:hideMark/>
           </w:tcPr>
           <w:p>
             <w:pPr>
+              <w:spacing w:after="0" w:line="240" w:lineRule="auto"/>
               <w:jc w:val="center"/>
               <w:rPr>
                 <w:rFonts w:ascii="Arial" w:eastAsia="Arial" w:hAnsi="Arial" w:cs="Arial"/>
                 <w:b/>
+                <w:color w:val="404040"/>
+                <w:sz w:val="16"/>
+                <w:szCs w:val="16"/>
               </w:rPr>
             </w:pPr>
             <w:r>
               <w:rPr>
                 <w:rFonts w:ascii="Arial" w:eastAsia="Arial" w:hAnsi="Arial" w:cs="Arial"/>
                 <w:b/>
+                <w:color w:val="404040"/>
+                <w:sz w:val="16"/>
+                <w:szCs w:val="16"/>
               </w:rPr>
               <w:t>Valor</w:t>
             </w:r>
@@ -960,7 +1049,7 @@
         </w:trPr>
         <w:tc>
           <w:tcPr>
-            <w:tcW w:w="3261" w:type="dxa"/>
+            <w:tcW w:w="3260" w:type="dxa"/>
             <w:gridSpan w:val="2"/>
             <w:tcBorders>
               <w:top w:val="single" w:sz="4" w:space="0" w:color="000000"/>
@@ -975,37 +1064,27 @@
               <w:right w:w="45" w:type="dxa"/>
             </w:tcMar>
             <w:vAlign w:val="center"/>
+            <w:hideMark/>
           </w:tcPr>
           <w:p>
             <w:pPr>
+              <w:spacing w:after="0" w:line="240" w:lineRule="auto"/>
               <w:jc w:val="center"/>
               <w:rPr>
                 <w:rFonts w:ascii="Arial" w:eastAsia="Arial" w:hAnsi="Arial" w:cs="Arial"/>
-                <w:bCs/>
+                <w:color w:val="404040"/>
+                <w:sz w:val="16"/>
+                <w:szCs w:val="16"/>
               </w:rPr>
             </w:pPr>
             <w:r>
               <w:rPr>
                 <w:rFonts w:ascii="Arial" w:eastAsia="Arial" w:hAnsi="Arial" w:cs="Arial"/>
-                <w:bCs/>
-              </w:rPr>
-              <w:t>{{</w:t>
-            </w:r>
-            <w:proofErr w:type="spellStart"/>
-            <w:r>
-              <w:rPr>
-                <w:rFonts w:ascii="Arial" w:eastAsia="Arial" w:hAnsi="Arial" w:cs="Arial"/>
-                <w:bCs/>
-              </w:rPr>
-              <w:t>nf_recibo</w:t>
-            </w:r>
-            <w:proofErr w:type="spellEnd"/>
-            <w:r>
-              <w:rPr>
-                <w:rFonts w:ascii="Arial" w:eastAsia="Arial" w:hAnsi="Arial" w:cs="Arial"/>
-                <w:bCs/>
-              </w:rPr>
-              <w:t>}}</w:t>
+                <w:color w:val="404040"/>
+                <w:sz w:val="16"/>
+                <w:szCs w:val="16"/>
+              </w:rPr>
+              <w:t>{{nf_recibo}}</w:t>
             </w:r>
           </w:p>
         </w:tc>
@@ -1026,37 +1105,27 @@
               <w:right w:w="45" w:type="dxa"/>
             </w:tcMar>
             <w:vAlign w:val="center"/>
+            <w:hideMark/>
           </w:tcPr>
           <w:p>
             <w:pPr>
+              <w:spacing w:after="0" w:line="240" w:lineRule="auto"/>
               <w:jc w:val="center"/>
               <w:rPr>
                 <w:rFonts w:ascii="Arial" w:eastAsia="Arial" w:hAnsi="Arial" w:cs="Arial"/>
-                <w:bCs/>
+                <w:color w:val="404040"/>
+                <w:sz w:val="16"/>
+                <w:szCs w:val="16"/>
               </w:rPr>
             </w:pPr>
             <w:r>
               <w:rPr>
                 <w:rFonts w:ascii="Arial" w:eastAsia="Arial" w:hAnsi="Arial" w:cs="Arial"/>
-                <w:bCs/>
-              </w:rPr>
-              <w:t>{{</w:t>
-            </w:r>
-            <w:proofErr w:type="spellStart"/>
-            <w:r>
-              <w:rPr>
-                <w:rFonts w:ascii="Arial" w:eastAsia="Arial" w:hAnsi="Arial" w:cs="Arial"/>
-                <w:bCs/>
-              </w:rPr>
-              <w:t>data_emissao</w:t>
-            </w:r>
-            <w:proofErr w:type="spellEnd"/>
-            <w:r>
-              <w:rPr>
-                <w:rFonts w:ascii="Arial" w:eastAsia="Arial" w:hAnsi="Arial" w:cs="Arial"/>
-                <w:bCs/>
-              </w:rPr>
-              <w:t>}}</w:t>
+                <w:color w:val="404040"/>
+                <w:sz w:val="16"/>
+                <w:szCs w:val="16"/>
+              </w:rPr>
+              <w:t>{{data_emissao}}</w:t>
             </w:r>
           </w:p>
         </w:tc>
@@ -1076,37 +1145,54 @@
               <w:right w:w="45" w:type="dxa"/>
             </w:tcMar>
             <w:vAlign w:val="center"/>
+            <w:hideMark/>
           </w:tcPr>
           <w:p>
             <w:pPr>
+              <w:spacing w:after="0" w:line="240" w:lineRule="auto"/>
               <w:jc w:val="center"/>
               <w:rPr>
                 <w:rFonts w:ascii="Arial" w:eastAsia="Arial" w:hAnsi="Arial" w:cs="Arial"/>
-                <w:bCs/>
+                <w:color w:val="404040"/>
+                <w:sz w:val="16"/>
+                <w:szCs w:val="16"/>
               </w:rPr>
             </w:pPr>
             <w:r>
               <w:rPr>
                 <w:rFonts w:ascii="Arial" w:eastAsia="Arial" w:hAnsi="Arial" w:cs="Arial"/>
-                <w:bCs/>
-              </w:rPr>
-              <w:t>{{</w:t>
-            </w:r>
-            <w:proofErr w:type="spellStart"/>
-            <w:r>
-              <w:rPr>
-                <w:rFonts w:ascii="Arial" w:eastAsia="Arial" w:hAnsi="Arial" w:cs="Arial"/>
-                <w:bCs/>
-              </w:rPr>
-              <w:t>data_pagamento</w:t>
-            </w:r>
-            <w:proofErr w:type="spellEnd"/>
-            <w:r>
-              <w:rPr>
-                <w:rFonts w:ascii="Arial" w:eastAsia="Arial" w:hAnsi="Arial" w:cs="Arial"/>
-                <w:bCs/>
-              </w:rPr>
-              <w:t>}}</w:t>
+                <w:color w:val="404040"/>
+                <w:sz w:val="16"/>
+                <w:szCs w:val="16"/>
+              </w:rPr>
+              <w:t>{</w:t>
+            </w:r>
+            <w:r>
+              <w:rPr>
+                <w:rFonts w:ascii="Arial" w:eastAsia="Arial" w:hAnsi="Arial" w:cs="Arial"/>
+                <w:color w:val="404040"/>
+                <w:sz w:val="16"/>
+                <w:szCs w:val="16"/>
+              </w:rPr>
+              <w:t>{</w:t>
+            </w:r>
+            <w:r>
+              <w:rPr>
+                <w:rFonts w:ascii="Arial" w:eastAsia="Arial" w:hAnsi="Arial" w:cs="Arial"/>
+                <w:color w:val="404040"/>
+                <w:sz w:val="16"/>
+                <w:szCs w:val="16"/>
+              </w:rPr>
+              <w:t>data_pagamento}</w:t>
+            </w:r>
+            <w:r>
+              <w:rPr>
+                <w:rFonts w:ascii="Arial" w:eastAsia="Arial" w:hAnsi="Arial" w:cs="Arial"/>
+                <w:color w:val="404040"/>
+                <w:sz w:val="16"/>
+                <w:szCs w:val="16"/>
+              </w:rPr>
+              <w:t>}</w:t>
             </w:r>
           </w:p>
         </w:tc>
@@ -1127,37 +1213,27 @@
               <w:right w:w="45" w:type="dxa"/>
             </w:tcMar>
             <w:vAlign w:val="center"/>
+            <w:hideMark/>
           </w:tcPr>
           <w:p>
             <w:pPr>
+              <w:spacing w:after="0" w:line="240" w:lineRule="auto"/>
               <w:jc w:val="center"/>
               <w:rPr>
                 <w:rFonts w:ascii="Arial" w:eastAsia="Arial" w:hAnsi="Arial" w:cs="Arial"/>
-                <w:bCs/>
+                <w:color w:val="404040"/>
+                <w:sz w:val="16"/>
+                <w:szCs w:val="16"/>
               </w:rPr>
             </w:pPr>
             <w:r>
               <w:rPr>
                 <w:rFonts w:ascii="Arial" w:eastAsia="Arial" w:hAnsi="Arial" w:cs="Arial"/>
-                <w:bCs/>
-              </w:rPr>
-              <w:t>{{</w:t>
-            </w:r>
-            <w:proofErr w:type="spellStart"/>
-            <w:r>
-              <w:rPr>
-                <w:rFonts w:ascii="Arial" w:eastAsia="Arial" w:hAnsi="Arial" w:cs="Arial"/>
-                <w:bCs/>
-              </w:rPr>
-              <w:t>valor_pago</w:t>
-            </w:r>
-            <w:proofErr w:type="spellEnd"/>
-            <w:r>
-              <w:rPr>
-                <w:rFonts w:ascii="Arial" w:eastAsia="Arial" w:hAnsi="Arial" w:cs="Arial"/>
-                <w:bCs/>
-              </w:rPr>
-              <w:t>}}</w:t>
+                <w:color w:val="404040"/>
+                <w:sz w:val="16"/>
+                <w:szCs w:val="16"/>
+              </w:rPr>
+              <w:t>{{valor_pago}}</w:t>
             </w:r>
           </w:p>
         </w:tc>

</xml_diff>